<commit_message>
Add References section to report
Cite the algorithm papers (Baum-Welch, Rabiner's HMM tutorial, Viterbi)
and tools (hmmlearn, Sensor Logger) the project actually relies on.
</commit_message>
<xml_diff>
--- a/report.docx
+++ b/report.docx
@@ -1290,6 +1290,97 @@
           <w:szCs w:val="24"/>
         </w:rPr>
         <w:t xml:space="preserve">Future improvements include continuous multi-activity recordings to learn realistic transitions, gait-rhythm-specific features such as narrow-band step-frequency power to better separate standing from walking, training data across more varied phone placements to reduce domain-shift sensitivity, and, with more data, a full-covariance or discriminative sequence model. Overall, this project demonstrates a complete HMM pipeline: robust preprocessing, justified features, Baum-Welch training with a documented and resolved initialization failure, and honest evaluation on domain-shifted test data. It perfectly separates the two most energy-distinct activities, and its standing/walking confusion is a well-understood limitation of the current feature set — directly informing next steps toward a deployable fall-risk monitoring system.</w:t>
+      </w:r>
+    </w:p>
+    <w:p>
+      <w:pPr>
+        <w:pStyle w:val="Heading1"/>
+        <w:spacing w:after="120" w:before="220"/>
+      </w:pPr>
+      <w:r>
+        <w:rPr>
+          <w:rFonts w:ascii="Times New Roman" w:cs="Times New Roman" w:eastAsia="Times New Roman" w:hAnsi="Times New Roman"/>
+          <w:b/>
+          <w:bCs/>
+          <w:sz w:val="32"/>
+          <w:szCs w:val="32"/>
+        </w:rPr>
+        <w:t xml:space="preserve">References</w:t>
+      </w:r>
+    </w:p>
+    <w:p>
+      <w:pPr>
+        <w:spacing w:after="160" w:line="276" w:lineRule="auto"/>
+        <w:ind w:left="720" w:hanging="720"/>
+        <w:jc w:val="left"/>
+      </w:pPr>
+      <w:r>
+        <w:rPr>
+          <w:rFonts w:ascii="Times New Roman" w:cs="Times New Roman" w:eastAsia="Times New Roman" w:hAnsi="Times New Roman"/>
+          <w:sz w:val="24"/>
+          <w:szCs w:val="24"/>
+        </w:rPr>
+        <w:t xml:space="preserve">Baum, L. E., Petrie, T., Soules, G., &amp; Weiss, N. (1970). A maximization technique occurring in the statistical analysis of probabilistic functions of Markov chains. The Annals of Mathematical Statistics, 41(1), 164–171.</w:t>
+      </w:r>
+    </w:p>
+    <w:p>
+      <w:pPr>
+        <w:spacing w:after="160" w:line="276" w:lineRule="auto"/>
+        <w:ind w:left="720" w:hanging="720"/>
+        <w:jc w:val="left"/>
+      </w:pPr>
+      <w:r>
+        <w:rPr>
+          <w:rFonts w:ascii="Times New Roman" w:cs="Times New Roman" w:eastAsia="Times New Roman" w:hAnsi="Times New Roman"/>
+          <w:sz w:val="24"/>
+          <w:szCs w:val="24"/>
+        </w:rPr>
+        <w:t xml:space="preserve">Rabiner, L. R. (1989). A tutorial on hidden Markov models and selected applications in speech recognition. Proceedings of the IEEE, 77(2), 257–286.</w:t>
+      </w:r>
+    </w:p>
+    <w:p>
+      <w:pPr>
+        <w:spacing w:after="160" w:line="276" w:lineRule="auto"/>
+        <w:ind w:left="720" w:hanging="720"/>
+        <w:jc w:val="left"/>
+      </w:pPr>
+      <w:r>
+        <w:rPr>
+          <w:rFonts w:ascii="Times New Roman" w:cs="Times New Roman" w:eastAsia="Times New Roman" w:hAnsi="Times New Roman"/>
+          <w:sz w:val="24"/>
+          <w:szCs w:val="24"/>
+        </w:rPr>
+        <w:t xml:space="preserve">Viterbi, A. J. (1967). Error bounds for convolutional codes and an asymptotically optimum decoding algorithm. IEEE Transactions on Information Theory, 13(2), 260–269.</w:t>
+      </w:r>
+    </w:p>
+    <w:p>
+      <w:pPr>
+        <w:spacing w:after="160" w:line="276" w:lineRule="auto"/>
+        <w:ind w:left="720" w:hanging="720"/>
+        <w:jc w:val="left"/>
+      </w:pPr>
+      <w:r>
+        <w:rPr>
+          <w:rFonts w:ascii="Times New Roman" w:cs="Times New Roman" w:eastAsia="Times New Roman" w:hAnsi="Times New Roman"/>
+          <w:sz w:val="24"/>
+          <w:szCs w:val="24"/>
+        </w:rPr>
+        <w:t xml:space="preserve">hmmlearn developers. (2024). hmmlearn (Version 0.3.3) [Computer software]. GitHub.</w:t>
+      </w:r>
+    </w:p>
+    <w:p>
+      <w:pPr>
+        <w:spacing w:after="160" w:line="276" w:lineRule="auto"/>
+        <w:ind w:left="720" w:hanging="720"/>
+        <w:jc w:val="left"/>
+      </w:pPr>
+      <w:r>
+        <w:rPr>
+          <w:rFonts w:ascii="Times New Roman" w:cs="Times New Roman" w:eastAsia="Times New Roman" w:hAnsi="Times New Roman"/>
+          <w:sz w:val="24"/>
+          <w:szCs w:val="24"/>
+        </w:rPr>
+        <w:t xml:space="preserve">Sensor Logger (Version 1.60.1) [Mobile application software]. (2026).</w:t>
       </w:r>
     </w:p>
     <w:sectPr>

</xml_diff>